<commit_message>
Updated Windows starting instructions
</commit_message>
<xml_diff>
--- a/Executables/All OSs - Scripts, Options, and Instructions to Users/Windows/Mesquite_Starter_INSTRUCTIONS_Windows.docx
+++ b/Executables/All OSs - Scripts, Options, and Instructions to Users/Windows/Mesquite_Starter_INSTRUCTIONS_Windows.docx
@@ -1,6 +1,6 @@
 
 <file path=word/document.xml><?xml version="1.0" encoding="utf-8"?>
-<w:document xmlns:wpc="http://schemas.microsoft.com/office/word/2010/wordprocessingCanvas" xmlns:cx="http://schemas.microsoft.com/office/drawing/2014/chartex" xmlns:cx1="http://schemas.microsoft.com/office/drawing/2015/9/8/chartex" xmlns:cx2="http://schemas.microsoft.com/office/drawing/2015/10/21/chartex" xmlns:cx3="http://schemas.microsoft.com/office/drawing/2016/5/9/chartex" xmlns:cx4="http://schemas.microsoft.com/office/drawing/2016/5/10/chartex" xmlns:cx5="http://schemas.microsoft.com/office/drawing/2016/5/11/chartex" xmlns:cx6="http://schemas.microsoft.com/office/drawing/2016/5/12/chartex" xmlns:cx7="http://schemas.microsoft.com/office/drawing/2016/5/13/chartex" xmlns:cx8="http://schemas.microsoft.com/office/drawing/2016/5/14/chartex" xmlns:mc="http://schemas.openxmlformats.org/markup-compatibility/2006" xmlns:aink="http://schemas.microsoft.com/office/drawing/2016/ink" xmlns:am3d="http://schemas.microsoft.com/office/drawing/2017/model3d" xmlns:o="urn:schemas-microsoft-com:office:office" xmlns:oel="http://schemas.microsoft.com/office/2019/extlst" xmlns:r="http://schemas.openxmlformats.org/officeDocument/2006/relationships" xmlns:m="http://schemas.openxmlformats.org/officeDocument/2006/math" xmlns:v="urn:schemas-microsoft-com:vml" xmlns:wp14="http://schemas.microsoft.com/office/word/2010/wordprocessingDrawing" xmlns:wp="http://schemas.openxmlformats.org/drawingml/2006/wordprocessingDrawing" xmlns:w10="urn:schemas-microsoft-com:office:word" xmlns:w="http://schemas.openxmlformats.org/wordprocessingml/2006/main" xmlns:w14="http://schemas.microsoft.com/office/word/2010/wordml" xmlns:w15="http://schemas.microsoft.com/office/word/2012/wordml" xmlns:w16cex="http://schemas.microsoft.com/office/word/2018/wordml/cex" xmlns:w16cid="http://schemas.microsoft.com/office/word/2016/wordml/cid" xmlns:w16="http://schemas.microsoft.com/office/word/2018/wordml" xmlns:w16sdtdh="http://schemas.microsoft.com/office/word/2020/wordml/sdtdatahash" xmlns:w16se="http://schemas.microsoft.com/office/word/2015/wordml/symex" xmlns:wpg="http://schemas.microsoft.com/office/word/2010/wordprocessingGroup" xmlns:wpi="http://schemas.microsoft.com/office/word/2010/wordprocessingInk" xmlns:wne="http://schemas.microsoft.com/office/word/2006/wordml" xmlns:wps="http://schemas.microsoft.com/office/word/2010/wordprocessingShape" mc:Ignorable="w14 w15 w16se w16cid w16 w16cex w16sdtdh wp14">
+<w:document xmlns:wpc="http://schemas.microsoft.com/office/word/2010/wordprocessingCanvas" xmlns:cx="http://schemas.microsoft.com/office/drawing/2014/chartex" xmlns:cx1="http://schemas.microsoft.com/office/drawing/2015/9/8/chartex" xmlns:cx2="http://schemas.microsoft.com/office/drawing/2015/10/21/chartex" xmlns:cx3="http://schemas.microsoft.com/office/drawing/2016/5/9/chartex" xmlns:cx4="http://schemas.microsoft.com/office/drawing/2016/5/10/chartex" xmlns:cx5="http://schemas.microsoft.com/office/drawing/2016/5/11/chartex" xmlns:cx6="http://schemas.microsoft.com/office/drawing/2016/5/12/chartex" xmlns:cx7="http://schemas.microsoft.com/office/drawing/2016/5/13/chartex" xmlns:cx8="http://schemas.microsoft.com/office/drawing/2016/5/14/chartex" xmlns:mc="http://schemas.openxmlformats.org/markup-compatibility/2006" xmlns:aink="http://schemas.microsoft.com/office/drawing/2016/ink" xmlns:am3d="http://schemas.microsoft.com/office/drawing/2017/model3d" xmlns:o="urn:schemas-microsoft-com:office:office" xmlns:oel="http://schemas.microsoft.com/office/2019/extlst" xmlns:r="http://schemas.openxmlformats.org/officeDocument/2006/relationships" xmlns:m="http://schemas.openxmlformats.org/officeDocument/2006/math" xmlns:v="urn:schemas-microsoft-com:vml" xmlns:wp14="http://schemas.microsoft.com/office/word/2010/wordprocessingDrawing" xmlns:wp="http://schemas.openxmlformats.org/drawingml/2006/wordprocessingDrawing" xmlns:w10="urn:schemas-microsoft-com:office:word" xmlns:w="http://schemas.openxmlformats.org/wordprocessingml/2006/main" xmlns:w14="http://schemas.microsoft.com/office/word/2010/wordml" xmlns:w15="http://schemas.microsoft.com/office/word/2012/wordml" xmlns:w16cex="http://schemas.microsoft.com/office/word/2018/wordml/cex" xmlns:w16cid="http://schemas.microsoft.com/office/word/2016/wordml/cid" xmlns:w16="http://schemas.microsoft.com/office/word/2018/wordml" xmlns:w16du="http://schemas.microsoft.com/office/word/2023/wordml/word16du" xmlns:w16sdtdh="http://schemas.microsoft.com/office/word/2020/wordml/sdtdatahash" xmlns:w16sdtfl="http://schemas.microsoft.com/office/word/2024/wordml/sdtformatlock" xmlns:w16se="http://schemas.microsoft.com/office/word/2015/wordml/symex" xmlns:wpg="http://schemas.microsoft.com/office/word/2010/wordprocessingGroup" xmlns:wpi="http://schemas.microsoft.com/office/word/2010/wordprocessingInk" xmlns:wne="http://schemas.microsoft.com/office/word/2006/wordml" xmlns:wps="http://schemas.microsoft.com/office/word/2010/wordprocessingShape" mc:Ignorable="w14 w15 w16se w16cid w16 w16cex w16sdtdh w16sdtfl w16du wp14">
   <w:body>
     <w:p>
       <w:pPr>
@@ -50,7 +50,31 @@
         <w:t xml:space="preserve">e </w:t>
       </w:r>
       <w:r>
-        <w:t xml:space="preserve">recommend Java 21 or later. Some functions will work only if you have Java 17 or later. The absolute minimum is Java 9. Download the </w:t>
+        <w:t>recommend Java 21 or later.</w:t>
+      </w:r>
+      <w:r>
+        <w:t xml:space="preserve"> Java 17 is required.  Y</w:t>
+      </w:r>
+      <w:r>
+        <w:t xml:space="preserve">ou might be able to get it to run under an older Java, but </w:t>
+      </w:r>
+      <w:r>
+        <w:t xml:space="preserve">some functions will not work and </w:t>
+      </w:r>
+      <w:r>
+        <w:t>strange things could happe</w:t>
+      </w:r>
+      <w:r>
+        <w:t>n</w:t>
+      </w:r>
+      <w:r>
+        <w:t xml:space="preserve">. </w:t>
+      </w:r>
+      <w:r>
+        <w:t>Make sure you download</w:t>
+      </w:r>
+      <w:r>
+        <w:t xml:space="preserve"> the </w:t>
       </w:r>
       <w:r>
         <w:rPr>
@@ -82,7 +106,13 @@
     <w:p/>
     <w:p>
       <w:r>
-        <w:t xml:space="preserve">You should NOT try to run Mesquite from the .zip file that you downloaded. You should copy </w:t>
+        <w:t xml:space="preserve">You should NOT try to run Mesquite from the .zip file that you downloaded. You </w:t>
+      </w:r>
+      <w:r>
+        <w:t>will need to extract</w:t>
+      </w:r>
+      <w:r>
+        <w:t xml:space="preserve"> </w:t>
       </w:r>
       <w:proofErr w:type="spellStart"/>
       <w:r>
@@ -90,9 +120,30 @@
       </w:r>
       <w:proofErr w:type="spellEnd"/>
       <w:r>
-        <w:t xml:space="preserve"> to your storage drive and run it from there.</w:t>
-      </w:r>
-    </w:p>
+        <w:t xml:space="preserve"> </w:t>
+      </w:r>
+      <w:r>
+        <w:t xml:space="preserve">from the .zip file and move it </w:t>
+      </w:r>
+      <w:r>
+        <w:t xml:space="preserve">to your storage </w:t>
+      </w:r>
+      <w:proofErr w:type="gramStart"/>
+      <w:r>
+        <w:t>drive</w:t>
+      </w:r>
+      <w:r>
+        <w:t>,</w:t>
+      </w:r>
+      <w:r>
+        <w:t xml:space="preserve"> and</w:t>
+      </w:r>
+      <w:proofErr w:type="gramEnd"/>
+      <w:r>
+        <w:t xml:space="preserve"> run it from there.</w:t>
+      </w:r>
+    </w:p>
+    <w:p/>
     <w:p/>
     <w:p>
       <w:pPr>
@@ -135,6 +186,14 @@
       </w:r>
     </w:p>
     <w:p/>
+    <w:p>
+      <w:pPr>
+        <w:rPr>
+          <w:b/>
+          <w:bCs/>
+        </w:rPr>
+      </w:pPr>
+    </w:p>
     <w:p>
       <w:pPr>
         <w:rPr>
@@ -204,7 +263,18 @@
     <w:p/>
     <w:p>
       <w:r>
-        <w:t>If this doesn't work for you, you could try the executable script</w:t>
+        <w:t xml:space="preserve">If this doesn't work for you, you could try </w:t>
+      </w:r>
+      <w:r>
+        <w:t xml:space="preserve">the following:  Open the folder </w:t>
+      </w:r>
+      <w:proofErr w:type="spellStart"/>
+      <w:r>
+        <w:t>RunningOptions</w:t>
+      </w:r>
+      <w:proofErr w:type="spellEnd"/>
+      <w:r>
+        <w:t xml:space="preserve">, and move the file called </w:t>
       </w:r>
     </w:p>
     <w:p>
@@ -220,7 +290,7 @@
     </w:p>
     <w:p>
       <w:r>
-        <w:t xml:space="preserve">which is in the </w:t>
+        <w:t xml:space="preserve">out of the </w:t>
       </w:r>
       <w:proofErr w:type="spellStart"/>
       <w:r>
@@ -228,14 +298,162 @@
       </w:r>
       <w:proofErr w:type="spellEnd"/>
       <w:r>
-        <w:t xml:space="preserve"> folder. However, before using it, you will need to move it out of the </w:t>
+        <w:t xml:space="preserve"> folder and put it directly into </w:t>
       </w:r>
       <w:proofErr w:type="spellStart"/>
       <w:r>
+        <w:t>Mesquite_Folder</w:t>
+      </w:r>
+      <w:proofErr w:type="spellEnd"/>
+      <w:r>
+        <w:t xml:space="preserve">.  Then, double click on Mesquite_Starter.bat.  </w:t>
+      </w:r>
+    </w:p>
+    <w:p/>
+    <w:p>
+      <w:r>
+        <w:t>If Mesquite_Starter.bat also doesn’t work, try the executable script</w:t>
+      </w:r>
+    </w:p>
+    <w:p>
+      <w:pPr>
+        <w:ind w:left="720"/>
+      </w:pPr>
+      <w:r>
+        <w:rPr>
+          <w:b/>
+        </w:rPr>
+        <w:t>Alternative_</w:t>
+      </w:r>
+      <w:r>
+        <w:rPr>
+          <w:b/>
+        </w:rPr>
+        <w:t>Mesquite_Starter.bat</w:t>
+      </w:r>
+    </w:p>
+    <w:p>
+      <w:r>
+        <w:t xml:space="preserve">instead.  To do this, open the folder </w:t>
+      </w:r>
+      <w:proofErr w:type="spellStart"/>
+      <w:r>
         <w:t>RunningOptions</w:t>
       </w:r>
       <w:proofErr w:type="spellEnd"/>
       <w:r>
+        <w:t xml:space="preserve">, and move </w:t>
+      </w:r>
+      <w:r>
+        <w:t>Alternative_Mesquite_Starter.bat</w:t>
+      </w:r>
+      <w:r>
+        <w:t xml:space="preserve"> out</w:t>
+      </w:r>
+      <w:r>
+        <w:t xml:space="preserve"> of</w:t>
+      </w:r>
+      <w:r>
+        <w:t xml:space="preserve"> there and put it</w:t>
+      </w:r>
+      <w:r>
+        <w:t xml:space="preserve"> directly into </w:t>
+      </w:r>
+      <w:proofErr w:type="spellStart"/>
+      <w:r>
+        <w:t>Mesquite_Folder</w:t>
+      </w:r>
+      <w:proofErr w:type="spellEnd"/>
+      <w:r>
+        <w:t>.</w:t>
+      </w:r>
+      <w:r>
+        <w:t xml:space="preserve"> </w:t>
+      </w:r>
+      <w:r>
+        <w:t>Then, double click on Alternative_Mesquite_Starter.bat.</w:t>
+      </w:r>
+    </w:p>
+    <w:p/>
+    <w:p>
+      <w:r>
+        <w:t>If Mesquite still won’t start, then please see the section below, “What if Mesquite Still Doesn’t Start?”</w:t>
+      </w:r>
+    </w:p>
+    <w:p/>
+    <w:p/>
+    <w:p/>
+    <w:p/>
+    <w:p>
+      <w:pPr>
+        <w:rPr>
+          <w:b/>
+          <w:bCs/>
+        </w:rPr>
+      </w:pPr>
+      <w:r>
+        <w:rPr>
+          <w:b/>
+          <w:bCs/>
+        </w:rPr>
+        <w:t xml:space="preserve">CUSTOMIZATIONS, including </w:t>
+      </w:r>
+      <w:r>
+        <w:rPr>
+          <w:b/>
+          <w:bCs/>
+        </w:rPr>
+        <w:t>MORE MEMORY</w:t>
+      </w:r>
+    </w:p>
+    <w:p>
+      <w:r>
+        <w:t xml:space="preserve">It is possible that for large datasets, Mesquite_Starter.exe may not request enough memory. If you run into an </w:t>
+      </w:r>
+      <w:proofErr w:type="spellStart"/>
+      <w:r>
+        <w:t>OutOfMemoryError</w:t>
+      </w:r>
+      <w:proofErr w:type="spellEnd"/>
+      <w:r>
+        <w:t xml:space="preserve">, you may want to try the alternative starters. Within the </w:t>
+      </w:r>
+      <w:proofErr w:type="spellStart"/>
+      <w:r>
+        <w:t>RunningOptions</w:t>
+      </w:r>
+      <w:proofErr w:type="spellEnd"/>
+      <w:r>
+        <w:t xml:space="preserve"> are a series of alternative executables, named "</w:t>
+      </w:r>
+      <w:r>
+        <w:rPr>
+          <w:b/>
+          <w:bCs/>
+        </w:rPr>
+        <w:t>Mesquite_Starter_#GB.exe</w:t>
+      </w:r>
+      <w:r>
+        <w:rPr>
+          <w:bCs/>
+        </w:rPr>
+        <w:t xml:space="preserve">", where # is 8, 16, 32, 64, or 128. The number indicates the GB of memory that Mesquite will reserve for its use. </w:t>
+      </w:r>
+      <w:r>
+        <w:t xml:space="preserve"> For genomic datasets, e.g. 100 taxa and over 1,000,000 characters, you may need 32 GB or higher.</w:t>
+      </w:r>
+    </w:p>
+    <w:p/>
+    <w:p>
+      <w:r>
+        <w:t xml:space="preserve">However, before using any of these alternative executables, you will need to move it out of the </w:t>
+      </w:r>
+      <w:proofErr w:type="spellStart"/>
+      <w:r>
+        <w:t>RunningOptions</w:t>
+      </w:r>
+      <w:proofErr w:type="spellEnd"/>
+      <w:r>
         <w:t xml:space="preserve"> folder and put it directly into </w:t>
       </w:r>
       <w:proofErr w:type="spellStart"/>
@@ -248,6 +466,14 @@
       </w:r>
     </w:p>
     <w:p/>
+    <w:p>
+      <w:r>
+        <w:t>You can also do other customization by editing the executable script Mesquite_Starter.bat.</w:t>
+      </w:r>
+    </w:p>
+    <w:p/>
+    <w:p/>
+    <w:p/>
     <w:p/>
     <w:p>
       <w:pPr>
@@ -261,169 +487,91 @@
           <w:b/>
           <w:bCs/>
         </w:rPr>
-        <w:t xml:space="preserve">CUSTOMIZATIONS, including </w:t>
-      </w:r>
-      <w:r>
-        <w:rPr>
-          <w:b/>
-          <w:bCs/>
-        </w:rPr>
-        <w:t>MORE MEMORY</w:t>
-      </w:r>
-    </w:p>
-    <w:p>
-      <w:r>
-        <w:t xml:space="preserve">It is possible that for large datasets, Mesquite_Starter.exe may not request enough memory. If you run into an </w:t>
+        <w:t>WHAT IF MESQUITE STILL DOESN'T START?</w:t>
+      </w:r>
+    </w:p>
+    <w:p>
+      <w:pPr>
+        <w:rPr>
+          <w:b/>
+          <w:bCs/>
+        </w:rPr>
+      </w:pPr>
+    </w:p>
+    <w:p>
+      <w:r>
+        <w:t>First, make sure you have java installed. One way to check is to go to the Terminal or Command Prompt, and type "java --version" to see if the installed version of java is shown.</w:t>
+      </w:r>
+    </w:p>
+    <w:p/>
+    <w:p>
+      <w:r>
+        <w:t xml:space="preserve">Second, </w:t>
+      </w:r>
+      <w:r>
+        <w:rPr>
+          <w:i/>
+          <w:iCs/>
+        </w:rPr>
+        <w:t>make sure you haven't moved</w:t>
+      </w:r>
+      <w:r>
+        <w:t xml:space="preserve"> the starter app, which is the file called </w:t>
+      </w:r>
+      <w:r>
+        <w:rPr>
+          <w:b/>
+          <w:bCs/>
+        </w:rPr>
+        <w:t>Mesquite_Starter.exe</w:t>
+      </w:r>
+      <w:r>
+        <w:t>.  S</w:t>
+      </w:r>
+      <w:r>
+        <w:t xml:space="preserve">tarter apps </w:t>
+      </w:r>
+      <w:r>
+        <w:t xml:space="preserve">can be run </w:t>
+      </w:r>
+      <w:r>
+        <w:rPr>
+          <w:b/>
+          <w:bCs/>
+          <w:i/>
+          <w:iCs/>
+        </w:rPr>
+        <w:t>only</w:t>
+      </w:r>
+      <w:r>
+        <w:t xml:space="preserve"> if they are in</w:t>
+      </w:r>
+      <w:r>
+        <w:t xml:space="preserve"> </w:t>
       </w:r>
       <w:proofErr w:type="spellStart"/>
       <w:r>
-        <w:t>OutOfMemoryError</w:t>
+        <w:t>Mesquite_Folder</w:t>
       </w:r>
       <w:proofErr w:type="spellEnd"/>
       <w:r>
-        <w:t xml:space="preserve">, you may want to try the alternative starters. Within the </w:t>
+        <w:t>. These double-clickable apps do not hold all of Mesquite's working code; they just get the</w:t>
+      </w:r>
+      <w:r>
+        <w:t xml:space="preserve"> </w:t>
+      </w:r>
+      <w:r>
+        <w:t>code started. The working code is distributed among various f</w:t>
+      </w:r>
+      <w:r>
+        <w:t xml:space="preserve">iles in </w:t>
       </w:r>
       <w:proofErr w:type="spellStart"/>
       <w:r>
-        <w:t>RunningOptions</w:t>
+        <w:t>Mesquite_Folder</w:t>
       </w:r>
       <w:proofErr w:type="spellEnd"/>
       <w:r>
-        <w:t xml:space="preserve"> are a series of alternative executables, named </w:t>
-      </w:r>
-      <w:r>
-        <w:t>"</w:t>
-      </w:r>
-      <w:r>
-        <w:rPr>
-          <w:b/>
-          <w:bCs/>
-        </w:rPr>
-        <w:t>Mesquite_Starter_</w:t>
-      </w:r>
-      <w:r>
-        <w:rPr>
-          <w:b/>
-          <w:bCs/>
-        </w:rPr>
-        <w:t>#GB</w:t>
-      </w:r>
-      <w:r>
-        <w:rPr>
-          <w:b/>
-          <w:bCs/>
-        </w:rPr>
-        <w:t>.exe</w:t>
-      </w:r>
-      <w:r>
-        <w:rPr>
-          <w:bCs/>
-        </w:rPr>
-        <w:t xml:space="preserve">", where # is 8, 16, 32, 64, or 128. The number indicates the GB of memory that Mesquite will reserve for its use. </w:t>
-      </w:r>
-      <w:r>
-        <w:t xml:space="preserve"> </w:t>
-      </w:r>
-      <w:r>
-        <w:t>For genomic datasets, e.g. 100 taxa and over 1,000,000 characters, you may need 32 GB or higher</w:t>
-      </w:r>
-      <w:r>
-        <w:t>.</w:t>
-      </w:r>
-    </w:p>
-    <w:p/>
-    <w:p>
-      <w:r>
-        <w:t xml:space="preserve">However, before using any of these alternative executables, you will need to move it out of the </w:t>
-      </w:r>
-      <w:proofErr w:type="spellStart"/>
-      <w:r>
-        <w:t>RunningOptions</w:t>
-      </w:r>
-      <w:proofErr w:type="spellEnd"/>
-      <w:r>
-        <w:t xml:space="preserve"> folder and put it directly into </w:t>
-      </w:r>
-      <w:proofErr w:type="spellStart"/>
-      <w:r>
-        <w:t>Mesquite_Folder</w:t>
-      </w:r>
-      <w:proofErr w:type="spellEnd"/>
-      <w:r>
-        <w:t>.</w:t>
-      </w:r>
-    </w:p>
-    <w:p/>
-    <w:p>
-      <w:r>
-        <w:t>You can also do other customization by editing the executable script Mesquite_Starter.bat.</w:t>
-      </w:r>
-    </w:p>
-    <w:p/>
-    <w:p>
-      <w:pPr>
-        <w:rPr>
-          <w:b/>
-          <w:bCs/>
-        </w:rPr>
-      </w:pPr>
-      <w:r>
-        <w:rPr>
-          <w:b/>
-          <w:bCs/>
-        </w:rPr>
-        <w:lastRenderedPageBreak/>
-        <w:t>WHAT IF MESQUITE DOESN'T START?</w:t>
-      </w:r>
-    </w:p>
-    <w:p>
-      <w:r>
-        <w:t xml:space="preserve">First, make sure you have java installed. One way to check is to go to the </w:t>
-      </w:r>
-      <w:r>
-        <w:t xml:space="preserve">Terminal or </w:t>
-      </w:r>
-      <w:r>
-        <w:t>Command Prompt, and type "java --version" to see if the installed version of java is shown.</w:t>
-      </w:r>
-    </w:p>
-    <w:p/>
-    <w:p>
-      <w:r>
-        <w:t>Second, make sure you haven't moved the starter app. S</w:t>
-      </w:r>
-      <w:r>
-        <w:t xml:space="preserve">tarter apps </w:t>
-      </w:r>
-      <w:r>
-        <w:t>can be run only if they are in</w:t>
-      </w:r>
-      <w:r>
-        <w:t xml:space="preserve"> </w:t>
-      </w:r>
-      <w:proofErr w:type="spellStart"/>
-      <w:r>
-        <w:t>Mesquite_Folder</w:t>
-      </w:r>
-      <w:proofErr w:type="spellEnd"/>
-      <w:r>
-        <w:t>. These double-clickable apps do not hold all of Mesquite's working code; they just get the</w:t>
-      </w:r>
-      <w:r>
-        <w:t xml:space="preserve"> </w:t>
-      </w:r>
-      <w:r>
-        <w:t>code started. The working code is distributed among various f</w:t>
-      </w:r>
-      <w:r>
-        <w:t xml:space="preserve">iles in </w:t>
-      </w:r>
-      <w:proofErr w:type="spellStart"/>
-      <w:r>
-        <w:t>Mesquite_Folder</w:t>
-      </w:r>
-      <w:proofErr w:type="spellEnd"/>
-      <w:r>
         <w:t xml:space="preserve">. </w:t>
       </w:r>
     </w:p>
@@ -442,12 +590,23 @@
         <w:t xml:space="preserve">Fourth, there is a chance that Windows has changed since we released this version of Mesquite. Operating systems are constantly changing their security barriers, and it is difficult for us to keep up. </w:t>
       </w:r>
       <w:r>
-        <w:t>If you are technically inclined, and find a way to build a starter app that bypasses whatever is the latest challenge thrown our way, please share it with the Mesquite</w:t>
+        <w:t xml:space="preserve">If you are technically </w:t>
+      </w:r>
+      <w:proofErr w:type="gramStart"/>
+      <w:r>
+        <w:t>inclined, and</w:t>
+      </w:r>
+      <w:proofErr w:type="gramEnd"/>
+      <w:r>
+        <w:t xml:space="preserve"> find a way to build a starter app that bypasses whatever is the latest challenge thrown our way, please share it with the Mesquite</w:t>
       </w:r>
       <w:r>
         <w:t xml:space="preserve"> community!</w:t>
       </w:r>
     </w:p>
+    <w:p/>
+    <w:p/>
+    <w:p/>
     <w:sectPr>
       <w:pgSz w:w="12240" w:h="15840"/>
       <w:pgMar w:top="1440" w:right="1440" w:bottom="1440" w:left="1440" w:header="708" w:footer="708" w:gutter="0"/>
@@ -459,7 +618,7 @@
 </file>
 
 <file path=word/styles.xml><?xml version="1.0" encoding="utf-8"?>
-<w:styles xmlns:mc="http://schemas.openxmlformats.org/markup-compatibility/2006" xmlns:r="http://schemas.openxmlformats.org/officeDocument/2006/relationships" xmlns:w="http://schemas.openxmlformats.org/wordprocessingml/2006/main" xmlns:w14="http://schemas.microsoft.com/office/word/2010/wordml" xmlns:w15="http://schemas.microsoft.com/office/word/2012/wordml" xmlns:w16cex="http://schemas.microsoft.com/office/word/2018/wordml/cex" xmlns:w16cid="http://schemas.microsoft.com/office/word/2016/wordml/cid" xmlns:w16="http://schemas.microsoft.com/office/word/2018/wordml" xmlns:w16sdtdh="http://schemas.microsoft.com/office/word/2020/wordml/sdtdatahash" xmlns:w16se="http://schemas.microsoft.com/office/word/2015/wordml/symex" mc:Ignorable="w14 w15 w16se w16cid w16 w16cex w16sdtdh">
+<w:styles xmlns:mc="http://schemas.openxmlformats.org/markup-compatibility/2006" xmlns:r="http://schemas.openxmlformats.org/officeDocument/2006/relationships" xmlns:w="http://schemas.openxmlformats.org/wordprocessingml/2006/main" xmlns:w14="http://schemas.microsoft.com/office/word/2010/wordml" xmlns:w15="http://schemas.microsoft.com/office/word/2012/wordml" xmlns:w16cex="http://schemas.microsoft.com/office/word/2018/wordml/cex" xmlns:w16cid="http://schemas.microsoft.com/office/word/2016/wordml/cid" xmlns:w16="http://schemas.microsoft.com/office/word/2018/wordml" xmlns:w16du="http://schemas.microsoft.com/office/word/2023/wordml/word16du" xmlns:w16sdtdh="http://schemas.microsoft.com/office/word/2020/wordml/sdtdatahash" xmlns:w16sdtfl="http://schemas.microsoft.com/office/word/2024/wordml/sdtformatlock" xmlns:w16se="http://schemas.microsoft.com/office/word/2015/wordml/symex" mc:Ignorable="w14 w15 w16se w16cid w16 w16cex w16sdtdh w16sdtfl w16du">
   <w:docDefaults>
     <w:rPrDefault>
       <w:rPr>

</xml_diff>